<commit_message>
Add production ML engineering layer
</commit_message>
<xml_diff>
--- a/reports/Spotter_Machine_Learning_Assessment_Report.docx
+++ b/reports/Spotter_Machine_Learning_Assessment_Report.docx
@@ -1590,6 +1590,463 @@
         <w:t>The selected Ridge model provides the strongest validation MAE among the tested approaches and was retrained on the complete development dataset before producing the final assessment predictions.</w:t>
       </w:r>
     </w:p>
+    <w:p>
+      <w:r>
+        <w:br w:type="page"/>
+      </w:r>
+    </w:p>
+    <w:p>
+      <w:pPr>
+        <w:pStyle w:val="Heading1"/>
+      </w:pPr>
+      <w:r>
+        <w:t>17. Production Architecture and Future Deployment</w:t>
+      </w:r>
+    </w:p>
+    <w:p>
+      <w:r>
+        <w:rPr>
+          <w:b/>
+        </w:rPr>
+        <w:t xml:space="preserve">Scope. </w:t>
+      </w:r>
+      <w:r>
+        <w:t>Sections 1-16 describe the official assessment implementation and its results; they are unchanged. This section describes additional components that are NOT required by the assessment.</w:t>
+      </w:r>
+    </w:p>
+    <w:p>
+      <w:r>
+        <w:rPr>
+          <w:b/>
+        </w:rPr>
+        <w:t>The assessment solution is an offline batch ML pipeline. The additional production components provide a deployable architecture and local production simulation, but no public production deployment is claimed.</w:t>
+      </w:r>
+    </w:p>
+    <w:p>
+      <w:pPr>
+        <w:pStyle w:val="Heading2"/>
+      </w:pPr>
+      <w:r>
+        <w:t>17.1 Components</w:t>
+      </w:r>
+    </w:p>
+    <w:tbl>
+      <w:tblPr>
+        <w:tblStyle w:val="TableGrid"/>
+        <w:tblW w:type="auto" w:w="0"/>
+        <w:tblLook w:firstColumn="1" w:firstRow="1" w:lastColumn="0" w:lastRow="0" w:noHBand="0" w:noVBand="1" w:val="04A0"/>
+      </w:tblPr>
+      <w:tblGrid>
+        <w:gridCol w:w="4968"/>
+        <w:gridCol w:w="4968"/>
+      </w:tblGrid>
+      <w:tr>
+        <w:tc>
+          <w:tcPr>
+            <w:tcW w:type="dxa" w:w="4968"/>
+          </w:tcPr>
+          <w:p>
+            <w:r>
+              <w:rPr>
+                <w:b/>
+                <w:sz w:val="19"/>
+              </w:rPr>
+              <w:t>Component</w:t>
+            </w:r>
+          </w:p>
+        </w:tc>
+        <w:tc>
+          <w:tcPr>
+            <w:tcW w:type="dxa" w:w="4968"/>
+          </w:tcPr>
+          <w:p>
+            <w:r>
+              <w:rPr>
+                <w:b/>
+                <w:sz w:val="19"/>
+              </w:rPr>
+              <w:t>What it does</w:t>
+            </w:r>
+          </w:p>
+        </w:tc>
+      </w:tr>
+      <w:tr>
+        <w:tc>
+          <w:tcPr>
+            <w:tcW w:type="dxa" w:w="4968"/>
+          </w:tcPr>
+          <w:p>
+            <w:r>
+              <w:rPr>
+                <w:sz w:val="19"/>
+              </w:rPr>
+              <w:t>Prediction API (FastAPI)</w:t>
+            </w:r>
+          </w:p>
+        </w:tc>
+        <w:tc>
+          <w:tcPr>
+            <w:tcW w:type="dxa" w:w="4968"/>
+          </w:tcPr>
+          <w:p>
+            <w:r>
+              <w:rPr>
+                <w:sz w:val="19"/>
+              </w:rPr>
+              <w:t>GET /health, GET /model/info, POST /predict. Accepts raw load features and runs validation, cleaning, feature engineering, the Ridge model and expm1 server-side, reusing the assessment cleaning and feature code. Errors are returned as structured JSON without stack traces.</w:t>
+            </w:r>
+          </w:p>
+        </w:tc>
+      </w:tr>
+      <w:tr>
+        <w:tc>
+          <w:tcPr>
+            <w:tcW w:type="dxa" w:w="4968"/>
+          </w:tcPr>
+          <w:p>
+            <w:r>
+              <w:rPr>
+                <w:sz w:val="19"/>
+              </w:rPr>
+              <w:t>Docker</w:t>
+            </w:r>
+          </w:p>
+        </w:tc>
+        <w:tc>
+          <w:tcPr>
+            <w:tcW w:type="dxa" w:w="4968"/>
+          </w:tcPr>
+          <w:p>
+            <w:r>
+              <w:rPr>
+                <w:sz w:val="19"/>
+              </w:rPr>
+              <w:t>docker/Dockerfile (Python 3.13, non-root user, /health healthcheck) and docker-compose.yml for local development. No database, queue or cloud service is required.</w:t>
+            </w:r>
+          </w:p>
+        </w:tc>
+      </w:tr>
+      <w:tr>
+        <w:tc>
+          <w:tcPr>
+            <w:tcW w:type="dxa" w:w="4968"/>
+          </w:tcPr>
+          <w:p>
+            <w:r>
+              <w:rPr>
+                <w:sz w:val="19"/>
+              </w:rPr>
+              <w:t>Model registry</w:t>
+            </w:r>
+          </w:p>
+        </w:tc>
+        <w:tc>
+          <w:tcPr>
+            <w:tcW w:type="dxa" w:w="4968"/>
+          </w:tcPr>
+          <w:p>
+            <w:r>
+              <w:rPr>
+                <w:sz w:val="19"/>
+              </w:rPr>
+              <w:t>File-based: models/registry/model_vN/{model.joblib, metadata.json} plus production.json. Versions are immutable. v1 is a byte-identical copy of the assessment artifact.</w:t>
+            </w:r>
+          </w:p>
+        </w:tc>
+      </w:tr>
+      <w:tr>
+        <w:tc>
+          <w:tcPr>
+            <w:tcW w:type="dxa" w:w="4968"/>
+          </w:tcPr>
+          <w:p>
+            <w:r>
+              <w:rPr>
+                <w:sz w:val="19"/>
+              </w:rPr>
+              <w:t>Monitoring</w:t>
+            </w:r>
+          </w:p>
+        </w:tc>
+        <w:tc>
+          <w:tcPr>
+            <w:tcW w:type="dxa" w:w="4968"/>
+          </w:tcPr>
+          <w:p>
+            <w:r>
+              <w:rPr>
+                <w:sz w:val="19"/>
+              </w:rPr>
+              <w:t>Each prediction can be appended to a JSONL log (timestamp, load_id, prediction, interval, model version, latency). Summaries report counts, mean/median/min/max, distribution, latency and error count.</w:t>
+            </w:r>
+          </w:p>
+        </w:tc>
+      </w:tr>
+      <w:tr>
+        <w:tc>
+          <w:tcPr>
+            <w:tcW w:type="dxa" w:w="4968"/>
+          </w:tcPr>
+          <w:p>
+            <w:r>
+              <w:rPr>
+                <w:sz w:val="19"/>
+              </w:rPr>
+              <w:t>Drift detection</w:t>
+            </w:r>
+          </w:p>
+        </w:tc>
+        <w:tc>
+          <w:tcPr>
+            <w:tcW w:type="dxa" w:w="4968"/>
+          </w:tcPr>
+          <w:p>
+            <w:r>
+              <w:rPr>
+                <w:sz w:val="19"/>
+              </w:rPr>
+              <w:t>Population Stability Index for numeric inputs and category-frequency PSI for equipment, against the training data. PSI &lt; 0.10 stable, 0.10-0.25 warning, &gt; 0.25 drift.</w:t>
+            </w:r>
+          </w:p>
+        </w:tc>
+      </w:tr>
+      <w:tr>
+        <w:tc>
+          <w:tcPr>
+            <w:tcW w:type="dxa" w:w="4968"/>
+          </w:tcPr>
+          <w:p>
+            <w:r>
+              <w:rPr>
+                <w:sz w:val="19"/>
+              </w:rPr>
+              <w:t>Performance monitoring</w:t>
+            </w:r>
+          </w:p>
+        </w:tc>
+        <w:tc>
+          <w:tcPr>
+            <w:tcW w:type="dxa" w:w="4968"/>
+          </w:tcPr>
+          <w:p>
+            <w:r>
+              <w:rPr>
+                <w:sz w:val="19"/>
+              </w:rPr>
+              <w:t>When actual rates arrive: MAE, RMSE, MAPE and bias, grouped by equipment, distance bucket and month, compared with the holdout baseline. Without actuals the system reports 'actual target data unavailable'.</w:t>
+            </w:r>
+          </w:p>
+        </w:tc>
+      </w:tr>
+      <w:tr>
+        <w:tc>
+          <w:tcPr>
+            <w:tcW w:type="dxa" w:w="4968"/>
+          </w:tcPr>
+          <w:p>
+            <w:r>
+              <w:rPr>
+                <w:sz w:val="19"/>
+              </w:rPr>
+              <w:t>Retraining</w:t>
+            </w:r>
+          </w:p>
+        </w:tc>
+        <w:tc>
+          <w:tcPr>
+            <w:tcW w:type="dxa" w:w="4968"/>
+          </w:tcPr>
+          <w:p>
+            <w:r>
+              <w:rPr>
+                <w:sz w:val="19"/>
+              </w:rPr>
+              <w:t>scripts/train_production.py runs validate, clean, features, temporal evaluation, alpha selection, final training and registration. It never promotes automatically; a policy check can recommend retraining from drift, degraded performance or model age.</w:t>
+            </w:r>
+          </w:p>
+        </w:tc>
+      </w:tr>
+      <w:tr>
+        <w:tc>
+          <w:tcPr>
+            <w:tcW w:type="dxa" w:w="4968"/>
+          </w:tcPr>
+          <w:p>
+            <w:r>
+              <w:rPr>
+                <w:sz w:val="19"/>
+              </w:rPr>
+              <w:t>Promotion and rollback</w:t>
+            </w:r>
+          </w:p>
+        </w:tc>
+        <w:tc>
+          <w:tcPr>
+            <w:tcW w:type="dxa" w:w="4968"/>
+          </w:tcPr>
+          <w:p>
+            <w:r>
+              <w:rPr>
+                <w:sz w:val="19"/>
+              </w:rPr>
+              <w:t>scripts/promote_model.py and scripts/rollback_model.py validate the version (files, metadata, metrics, feature count, smoke prediction) and then rewrite production.json. Nothing is deleted.</w:t>
+            </w:r>
+          </w:p>
+        </w:tc>
+      </w:tr>
+      <w:tr>
+        <w:tc>
+          <w:tcPr>
+            <w:tcW w:type="dxa" w:w="4968"/>
+          </w:tcPr>
+          <w:p>
+            <w:r>
+              <w:rPr>
+                <w:sz w:val="19"/>
+              </w:rPr>
+              <w:t>Prediction intervals</w:t>
+            </w:r>
+          </w:p>
+        </w:tc>
+        <w:tc>
+          <w:tcPr>
+            <w:tcW w:type="dxa" w:w="4968"/>
+          </w:tcPr>
+          <w:p>
+            <w:r>
+              <w:rPr>
+                <w:sz w:val="19"/>
+              </w:rPr>
+              <w:t>Empirical, residual-based intervals from the temporal-validation residuals on the log scale (multiplicative), stored with the model. They are an API-only addition; the official assessment predictions have no interval.</w:t>
+            </w:r>
+          </w:p>
+        </w:tc>
+      </w:tr>
+      <w:tr>
+        <w:tc>
+          <w:tcPr>
+            <w:tcW w:type="dxa" w:w="4968"/>
+          </w:tcPr>
+          <w:p>
+            <w:r>
+              <w:rPr>
+                <w:sz w:val="19"/>
+              </w:rPr>
+              <w:t>CI/CD</w:t>
+            </w:r>
+          </w:p>
+        </w:tc>
+        <w:tc>
+          <w:tcPr>
+            <w:tcW w:type="dxa" w:w="4968"/>
+          </w:tcPr>
+          <w:p>
+            <w:r>
+              <w:rPr>
+                <w:sz w:val="19"/>
+              </w:rPr>
+              <w:t>GitHub Actions: tests.yml (imports, pytest, official scorer) and production-build.yml (tests, Docker build, container smoke check). No deployment step and no cloud credentials.</w:t>
+            </w:r>
+          </w:p>
+        </w:tc>
+      </w:tr>
+    </w:tbl>
+    <w:p>
+      <w:pPr>
+        <w:pStyle w:val="Heading2"/>
+      </w:pPr>
+      <w:r>
+        <w:t>17.2 Verified findings</w:t>
+      </w:r>
+    </w:p>
+    <w:p>
+      <w:pPr>
+        <w:pStyle w:val="ListBullet"/>
+      </w:pPr>
+      <w:r>
+        <w:t>Prediction parity: the production path (raw input to prediction) reproduces the official validation_predictions.csv for all 12,000 rows to within 1.5e-10 when a model is trained with the same code.</w:t>
+      </w:r>
+    </w:p>
+    <w:p>
+      <w:pPr>
+        <w:pStyle w:val="ListBullet"/>
+      </w:pPr>
+      <w:r>
+        <w:t>Alpha search: the production grid (0.001 to 100) reproduces the assessment result for alpha = 0.01 exactly (MAE 108.607337). The additional alpha = 0.001 is lower by 0.0006 MAE (about 0.0005%), a practical tie; the assessment model was not changed. A retraining run that selects strictly by MAE would therefore pick 0.001, and alpha can be pinned with --alphas 0.01.</w:t>
+      </w:r>
+    </w:p>
+    <w:p>
+      <w:pPr>
+        <w:pStyle w:val="ListBullet"/>
+      </w:pPr>
+      <w:r>
+        <w:t>Interval coverage: the 90% nominal interval, calibrated on September 2025 residuals, covered 87.5% of October 2025 holdout rows. It is therefore slightly optimistic, which is why it is described as empirical and not calibrated.</w:t>
+      </w:r>
+    </w:p>
+    <w:p>
+      <w:pPr>
+        <w:pStyle w:val="ListBullet"/>
+      </w:pPr>
+      <w:r>
+        <w:t>Drift: the assessment inputs (Nov-Dec 2025) show strong market_index drift against the training data (PSI above 3), consistent with the market-level shift already noted in the EDA. Other monitored features were stable.</w:t>
+      </w:r>
+    </w:p>
+    <w:p>
+      <w:pPr>
+        <w:pStyle w:val="Heading2"/>
+      </w:pPr>
+      <w:r>
+        <w:t>17.3 Limitations</w:t>
+      </w:r>
+    </w:p>
+    <w:p>
+      <w:pPr>
+        <w:pStyle w:val="ListBullet"/>
+      </w:pPr>
+      <w:r>
+        <w:t>No public production deployment, load balancer, authentication or rate limiting is provided.</w:t>
+      </w:r>
+    </w:p>
+    <w:p>
+      <w:pPr>
+        <w:pStyle w:val="ListBullet"/>
+      </w:pPr>
+      <w:r>
+        <w:t>Monitoring is batch and file based (JSONL plus scripts), not real-time streaming or alerting.</w:t>
+      </w:r>
+    </w:p>
+    <w:p>
+      <w:pPr>
+        <w:pStyle w:val="ListBullet"/>
+      </w:pPr>
+      <w:r>
+        <w:t>No production prediction log or actual target values exist yet, so no production accuracy is claimed.</w:t>
+      </w:r>
+    </w:p>
+    <w:p>
+      <w:pPr>
+        <w:pStyle w:val="ListBullet"/>
+      </w:pPr>
+      <w:r>
+        <w:t>Model files are pickles tied to the scikit-learn version that wrote them; only load files from a trusted registry.</w:t>
+      </w:r>
+    </w:p>
+    <w:p>
+      <w:pPr>
+        <w:pStyle w:val="ListBullet"/>
+      </w:pPr>
+      <w:r>
+        <w:t>The API loads the model at startup; promotion or rollback requires an API restart.</w:t>
+      </w:r>
+    </w:p>
+    <w:p>
+      <w:pPr>
+        <w:pStyle w:val="ListBullet"/>
+      </w:pPr>
+      <w:r>
+        <w:t>Prediction intervals are empirical, were slightly under-covering on the later holdout month, and are not calibrated probabilistic intervals.</w:t>
+      </w:r>
+    </w:p>
     <w:sectPr>
       <w:pgSz w:w="12240" w:h="15840"/>
       <w:pgMar w:top="1008" w:right="1152" w:bottom="1008" w:left="1152" w:header="720" w:footer="720" w:gutter="0"/>

</xml_diff>

<commit_message>
Clean repository for Spotter assessment
</commit_message>
<xml_diff>
--- a/reports/Spotter_Machine_Learning_Assessment_Report.docx
+++ b/reports/Spotter_Machine_Learning_Assessment_Report.docx
@@ -1590,463 +1590,6 @@
         <w:t>The selected Ridge model provides the strongest validation MAE among the tested approaches and was retrained on the complete development dataset before producing the final assessment predictions.</w:t>
       </w:r>
     </w:p>
-    <w:p>
-      <w:r>
-        <w:br w:type="page"/>
-      </w:r>
-    </w:p>
-    <w:p>
-      <w:pPr>
-        <w:pStyle w:val="Heading1"/>
-      </w:pPr>
-      <w:r>
-        <w:t>17. Production Architecture and Future Deployment</w:t>
-      </w:r>
-    </w:p>
-    <w:p>
-      <w:r>
-        <w:rPr>
-          <w:b/>
-        </w:rPr>
-        <w:t xml:space="preserve">Scope. </w:t>
-      </w:r>
-      <w:r>
-        <w:t>Sections 1-16 describe the official assessment implementation and its results; they are unchanged. This section describes additional components that are NOT required by the assessment.</w:t>
-      </w:r>
-    </w:p>
-    <w:p>
-      <w:r>
-        <w:rPr>
-          <w:b/>
-        </w:rPr>
-        <w:t>The assessment solution is an offline batch ML pipeline. The additional production components provide a deployable architecture and local production simulation, but no public production deployment is claimed.</w:t>
-      </w:r>
-    </w:p>
-    <w:p>
-      <w:pPr>
-        <w:pStyle w:val="Heading2"/>
-      </w:pPr>
-      <w:r>
-        <w:t>17.1 Components</w:t>
-      </w:r>
-    </w:p>
-    <w:tbl>
-      <w:tblPr>
-        <w:tblStyle w:val="TableGrid"/>
-        <w:tblW w:type="auto" w:w="0"/>
-        <w:tblLook w:firstColumn="1" w:firstRow="1" w:lastColumn="0" w:lastRow="0" w:noHBand="0" w:noVBand="1" w:val="04A0"/>
-      </w:tblPr>
-      <w:tblGrid>
-        <w:gridCol w:w="4968"/>
-        <w:gridCol w:w="4968"/>
-      </w:tblGrid>
-      <w:tr>
-        <w:tc>
-          <w:tcPr>
-            <w:tcW w:type="dxa" w:w="4968"/>
-          </w:tcPr>
-          <w:p>
-            <w:r>
-              <w:rPr>
-                <w:b/>
-                <w:sz w:val="19"/>
-              </w:rPr>
-              <w:t>Component</w:t>
-            </w:r>
-          </w:p>
-        </w:tc>
-        <w:tc>
-          <w:tcPr>
-            <w:tcW w:type="dxa" w:w="4968"/>
-          </w:tcPr>
-          <w:p>
-            <w:r>
-              <w:rPr>
-                <w:b/>
-                <w:sz w:val="19"/>
-              </w:rPr>
-              <w:t>What it does</w:t>
-            </w:r>
-          </w:p>
-        </w:tc>
-      </w:tr>
-      <w:tr>
-        <w:tc>
-          <w:tcPr>
-            <w:tcW w:type="dxa" w:w="4968"/>
-          </w:tcPr>
-          <w:p>
-            <w:r>
-              <w:rPr>
-                <w:sz w:val="19"/>
-              </w:rPr>
-              <w:t>Prediction API (FastAPI)</w:t>
-            </w:r>
-          </w:p>
-        </w:tc>
-        <w:tc>
-          <w:tcPr>
-            <w:tcW w:type="dxa" w:w="4968"/>
-          </w:tcPr>
-          <w:p>
-            <w:r>
-              <w:rPr>
-                <w:sz w:val="19"/>
-              </w:rPr>
-              <w:t>GET /health, GET /model/info, POST /predict. Accepts raw load features and runs validation, cleaning, feature engineering, the Ridge model and expm1 server-side, reusing the assessment cleaning and feature code. Errors are returned as structured JSON without stack traces.</w:t>
-            </w:r>
-          </w:p>
-        </w:tc>
-      </w:tr>
-      <w:tr>
-        <w:tc>
-          <w:tcPr>
-            <w:tcW w:type="dxa" w:w="4968"/>
-          </w:tcPr>
-          <w:p>
-            <w:r>
-              <w:rPr>
-                <w:sz w:val="19"/>
-              </w:rPr>
-              <w:t>Docker</w:t>
-            </w:r>
-          </w:p>
-        </w:tc>
-        <w:tc>
-          <w:tcPr>
-            <w:tcW w:type="dxa" w:w="4968"/>
-          </w:tcPr>
-          <w:p>
-            <w:r>
-              <w:rPr>
-                <w:sz w:val="19"/>
-              </w:rPr>
-              <w:t>docker/Dockerfile (Python 3.13, non-root user, /health healthcheck) and docker-compose.yml for local development. No database, queue or cloud service is required.</w:t>
-            </w:r>
-          </w:p>
-        </w:tc>
-      </w:tr>
-      <w:tr>
-        <w:tc>
-          <w:tcPr>
-            <w:tcW w:type="dxa" w:w="4968"/>
-          </w:tcPr>
-          <w:p>
-            <w:r>
-              <w:rPr>
-                <w:sz w:val="19"/>
-              </w:rPr>
-              <w:t>Model registry</w:t>
-            </w:r>
-          </w:p>
-        </w:tc>
-        <w:tc>
-          <w:tcPr>
-            <w:tcW w:type="dxa" w:w="4968"/>
-          </w:tcPr>
-          <w:p>
-            <w:r>
-              <w:rPr>
-                <w:sz w:val="19"/>
-              </w:rPr>
-              <w:t>File-based: models/registry/model_vN/{model.joblib, metadata.json} plus production.json. Versions are immutable. v1 is a byte-identical copy of the assessment artifact.</w:t>
-            </w:r>
-          </w:p>
-        </w:tc>
-      </w:tr>
-      <w:tr>
-        <w:tc>
-          <w:tcPr>
-            <w:tcW w:type="dxa" w:w="4968"/>
-          </w:tcPr>
-          <w:p>
-            <w:r>
-              <w:rPr>
-                <w:sz w:val="19"/>
-              </w:rPr>
-              <w:t>Monitoring</w:t>
-            </w:r>
-          </w:p>
-        </w:tc>
-        <w:tc>
-          <w:tcPr>
-            <w:tcW w:type="dxa" w:w="4968"/>
-          </w:tcPr>
-          <w:p>
-            <w:r>
-              <w:rPr>
-                <w:sz w:val="19"/>
-              </w:rPr>
-              <w:t>Each prediction can be appended to a JSONL log (timestamp, load_id, prediction, interval, model version, latency). Summaries report counts, mean/median/min/max, distribution, latency and error count.</w:t>
-            </w:r>
-          </w:p>
-        </w:tc>
-      </w:tr>
-      <w:tr>
-        <w:tc>
-          <w:tcPr>
-            <w:tcW w:type="dxa" w:w="4968"/>
-          </w:tcPr>
-          <w:p>
-            <w:r>
-              <w:rPr>
-                <w:sz w:val="19"/>
-              </w:rPr>
-              <w:t>Drift detection</w:t>
-            </w:r>
-          </w:p>
-        </w:tc>
-        <w:tc>
-          <w:tcPr>
-            <w:tcW w:type="dxa" w:w="4968"/>
-          </w:tcPr>
-          <w:p>
-            <w:r>
-              <w:rPr>
-                <w:sz w:val="19"/>
-              </w:rPr>
-              <w:t>Population Stability Index for numeric inputs and category-frequency PSI for equipment, against the training data. PSI &lt; 0.10 stable, 0.10-0.25 warning, &gt; 0.25 drift.</w:t>
-            </w:r>
-          </w:p>
-        </w:tc>
-      </w:tr>
-      <w:tr>
-        <w:tc>
-          <w:tcPr>
-            <w:tcW w:type="dxa" w:w="4968"/>
-          </w:tcPr>
-          <w:p>
-            <w:r>
-              <w:rPr>
-                <w:sz w:val="19"/>
-              </w:rPr>
-              <w:t>Performance monitoring</w:t>
-            </w:r>
-          </w:p>
-        </w:tc>
-        <w:tc>
-          <w:tcPr>
-            <w:tcW w:type="dxa" w:w="4968"/>
-          </w:tcPr>
-          <w:p>
-            <w:r>
-              <w:rPr>
-                <w:sz w:val="19"/>
-              </w:rPr>
-              <w:t>When actual rates arrive: MAE, RMSE, MAPE and bias, grouped by equipment, distance bucket and month, compared with the holdout baseline. Without actuals the system reports 'actual target data unavailable'.</w:t>
-            </w:r>
-          </w:p>
-        </w:tc>
-      </w:tr>
-      <w:tr>
-        <w:tc>
-          <w:tcPr>
-            <w:tcW w:type="dxa" w:w="4968"/>
-          </w:tcPr>
-          <w:p>
-            <w:r>
-              <w:rPr>
-                <w:sz w:val="19"/>
-              </w:rPr>
-              <w:t>Retraining</w:t>
-            </w:r>
-          </w:p>
-        </w:tc>
-        <w:tc>
-          <w:tcPr>
-            <w:tcW w:type="dxa" w:w="4968"/>
-          </w:tcPr>
-          <w:p>
-            <w:r>
-              <w:rPr>
-                <w:sz w:val="19"/>
-              </w:rPr>
-              <w:t>scripts/train_production.py runs validate, clean, features, temporal evaluation, alpha selection, final training and registration. It never promotes automatically; a policy check can recommend retraining from drift, degraded performance or model age.</w:t>
-            </w:r>
-          </w:p>
-        </w:tc>
-      </w:tr>
-      <w:tr>
-        <w:tc>
-          <w:tcPr>
-            <w:tcW w:type="dxa" w:w="4968"/>
-          </w:tcPr>
-          <w:p>
-            <w:r>
-              <w:rPr>
-                <w:sz w:val="19"/>
-              </w:rPr>
-              <w:t>Promotion and rollback</w:t>
-            </w:r>
-          </w:p>
-        </w:tc>
-        <w:tc>
-          <w:tcPr>
-            <w:tcW w:type="dxa" w:w="4968"/>
-          </w:tcPr>
-          <w:p>
-            <w:r>
-              <w:rPr>
-                <w:sz w:val="19"/>
-              </w:rPr>
-              <w:t>scripts/promote_model.py and scripts/rollback_model.py validate the version (files, metadata, metrics, feature count, smoke prediction) and then rewrite production.json. Nothing is deleted.</w:t>
-            </w:r>
-          </w:p>
-        </w:tc>
-      </w:tr>
-      <w:tr>
-        <w:tc>
-          <w:tcPr>
-            <w:tcW w:type="dxa" w:w="4968"/>
-          </w:tcPr>
-          <w:p>
-            <w:r>
-              <w:rPr>
-                <w:sz w:val="19"/>
-              </w:rPr>
-              <w:t>Prediction intervals</w:t>
-            </w:r>
-          </w:p>
-        </w:tc>
-        <w:tc>
-          <w:tcPr>
-            <w:tcW w:type="dxa" w:w="4968"/>
-          </w:tcPr>
-          <w:p>
-            <w:r>
-              <w:rPr>
-                <w:sz w:val="19"/>
-              </w:rPr>
-              <w:t>Empirical, residual-based intervals from the temporal-validation residuals on the log scale (multiplicative), stored with the model. They are an API-only addition; the official assessment predictions have no interval.</w:t>
-            </w:r>
-          </w:p>
-        </w:tc>
-      </w:tr>
-      <w:tr>
-        <w:tc>
-          <w:tcPr>
-            <w:tcW w:type="dxa" w:w="4968"/>
-          </w:tcPr>
-          <w:p>
-            <w:r>
-              <w:rPr>
-                <w:sz w:val="19"/>
-              </w:rPr>
-              <w:t>CI/CD</w:t>
-            </w:r>
-          </w:p>
-        </w:tc>
-        <w:tc>
-          <w:tcPr>
-            <w:tcW w:type="dxa" w:w="4968"/>
-          </w:tcPr>
-          <w:p>
-            <w:r>
-              <w:rPr>
-                <w:sz w:val="19"/>
-              </w:rPr>
-              <w:t>GitHub Actions: tests.yml (imports, pytest, official scorer) and production-build.yml (tests, Docker build, container smoke check). No deployment step and no cloud credentials.</w:t>
-            </w:r>
-          </w:p>
-        </w:tc>
-      </w:tr>
-    </w:tbl>
-    <w:p>
-      <w:pPr>
-        <w:pStyle w:val="Heading2"/>
-      </w:pPr>
-      <w:r>
-        <w:t>17.2 Verified findings</w:t>
-      </w:r>
-    </w:p>
-    <w:p>
-      <w:pPr>
-        <w:pStyle w:val="ListBullet"/>
-      </w:pPr>
-      <w:r>
-        <w:t>Prediction parity: the production path (raw input to prediction) reproduces the official validation_predictions.csv for all 12,000 rows to within 1.5e-10 when a model is trained with the same code.</w:t>
-      </w:r>
-    </w:p>
-    <w:p>
-      <w:pPr>
-        <w:pStyle w:val="ListBullet"/>
-      </w:pPr>
-      <w:r>
-        <w:t>Alpha search: the production grid (0.001 to 100) reproduces the assessment result for alpha = 0.01 exactly (MAE 108.607337). The additional alpha = 0.001 is lower by 0.0006 MAE (about 0.0005%), a practical tie; the assessment model was not changed. A retraining run that selects strictly by MAE would therefore pick 0.001, and alpha can be pinned with --alphas 0.01.</w:t>
-      </w:r>
-    </w:p>
-    <w:p>
-      <w:pPr>
-        <w:pStyle w:val="ListBullet"/>
-      </w:pPr>
-      <w:r>
-        <w:t>Interval coverage: the 90% nominal interval, calibrated on September 2025 residuals, covered 87.5% of October 2025 holdout rows. It is therefore slightly optimistic, which is why it is described as empirical and not calibrated.</w:t>
-      </w:r>
-    </w:p>
-    <w:p>
-      <w:pPr>
-        <w:pStyle w:val="ListBullet"/>
-      </w:pPr>
-      <w:r>
-        <w:t>Drift: the assessment inputs (Nov-Dec 2025) show strong market_index drift against the training data (PSI above 3), consistent with the market-level shift already noted in the EDA. Other monitored features were stable.</w:t>
-      </w:r>
-    </w:p>
-    <w:p>
-      <w:pPr>
-        <w:pStyle w:val="Heading2"/>
-      </w:pPr>
-      <w:r>
-        <w:t>17.3 Limitations</w:t>
-      </w:r>
-    </w:p>
-    <w:p>
-      <w:pPr>
-        <w:pStyle w:val="ListBullet"/>
-      </w:pPr>
-      <w:r>
-        <w:t>No public production deployment, load balancer, authentication or rate limiting is provided.</w:t>
-      </w:r>
-    </w:p>
-    <w:p>
-      <w:pPr>
-        <w:pStyle w:val="ListBullet"/>
-      </w:pPr>
-      <w:r>
-        <w:t>Monitoring is batch and file based (JSONL plus scripts), not real-time streaming or alerting.</w:t>
-      </w:r>
-    </w:p>
-    <w:p>
-      <w:pPr>
-        <w:pStyle w:val="ListBullet"/>
-      </w:pPr>
-      <w:r>
-        <w:t>No production prediction log or actual target values exist yet, so no production accuracy is claimed.</w:t>
-      </w:r>
-    </w:p>
-    <w:p>
-      <w:pPr>
-        <w:pStyle w:val="ListBullet"/>
-      </w:pPr>
-      <w:r>
-        <w:t>Model files are pickles tied to the scikit-learn version that wrote them; only load files from a trusted registry.</w:t>
-      </w:r>
-    </w:p>
-    <w:p>
-      <w:pPr>
-        <w:pStyle w:val="ListBullet"/>
-      </w:pPr>
-      <w:r>
-        <w:t>The API loads the model at startup; promotion or rollback requires an API restart.</w:t>
-      </w:r>
-    </w:p>
-    <w:p>
-      <w:pPr>
-        <w:pStyle w:val="ListBullet"/>
-      </w:pPr>
-      <w:r>
-        <w:t>Prediction intervals are empirical, were slightly under-covering on the later holdout month, and are not calibrated probabilistic intervals.</w:t>
-      </w:r>
-    </w:p>
     <w:sectPr>
       <w:pgSz w:w="12240" w:h="15840"/>
       <w:pgMar w:top="1008" w:right="1152" w:bottom="1008" w:left="1152" w:header="720" w:footer="720" w:gutter="0"/>

</xml_diff>